<commit_message>
Modified scraper to use manual api_token via browser to get around cloudflare issues.
</commit_message>
<xml_diff>
--- a/iNat scraper run instructions.docx
+++ b/iNat scraper run instructions.docx
@@ -32,7 +32,15 @@
     </w:p>
     <w:p>
       <w:r>
-        <w:t>Open VSCode (desktop shortcut)</w:t>
+        <w:t xml:space="preserve">Open </w:t>
+      </w:r>
+      <w:proofErr w:type="spellStart"/>
+      <w:r>
+        <w:t>VSCode</w:t>
+      </w:r>
+      <w:proofErr w:type="spellEnd"/>
+      <w:r>
+        <w:t xml:space="preserve"> (desktop shortcut)</w:t>
       </w:r>
     </w:p>
     <w:p>
@@ -79,7 +87,20 @@
         </w:numPr>
       </w:pPr>
       <w:r>
-        <w:t>Open “config_private.json”</w:t>
+        <w:t>Open “</w:t>
+      </w:r>
+      <w:proofErr w:type="spellStart"/>
+      <w:r>
+        <w:t>config_</w:t>
+      </w:r>
+      <w:proofErr w:type="gramStart"/>
+      <w:r>
+        <w:t>private.json</w:t>
+      </w:r>
+      <w:proofErr w:type="spellEnd"/>
+      <w:proofErr w:type="gramEnd"/>
+      <w:r>
+        <w:t>”</w:t>
       </w:r>
     </w:p>
     <w:p>
@@ -91,7 +112,15 @@
         </w:numPr>
       </w:pPr>
       <w:r>
-        <w:t>“taxonomy / tracking_list” is what will be downloaded for THAT run</w:t>
+        <w:t xml:space="preserve">Update </w:t>
+      </w:r>
+      <w:proofErr w:type="spellStart"/>
+      <w:r>
+        <w:t>api_token</w:t>
+      </w:r>
+      <w:proofErr w:type="spellEnd"/>
+      <w:r>
+        <w:t xml:space="preserve"> once every 24 hours (or if run fails)</w:t>
       </w:r>
     </w:p>
     <w:p>
@@ -102,8 +131,16 @@
           <w:numId w:val="1"/>
         </w:numPr>
       </w:pPr>
-      <w:r>
-        <w:t>Edit tracking list to what you want for run and then save file. Change config_private.json “taxonomy / tracking_list” file path to match. (Make sure to save file)</w:t>
+      <w:hyperlink r:id="rId5" w:history="1">
+        <w:r>
+          <w:rPr>
+            <w:rStyle w:val="Hyperlink"/>
+          </w:rPr>
+          <w:t>https://www.inaturalist.org/users/api_token</w:t>
+        </w:r>
+      </w:hyperlink>
+      <w:r>
+        <w:t xml:space="preserve"> (when logged in)</w:t>
       </w:r>
     </w:p>
     <w:p>
@@ -115,7 +152,56 @@
         </w:numPr>
       </w:pPr>
       <w:r>
-        <w:t>If you want to not use date_checked (for plants) just delete filepath name (leave “”).</w:t>
+        <w:t xml:space="preserve">“taxonomy / </w:t>
+      </w:r>
+      <w:proofErr w:type="spellStart"/>
+      <w:r>
+        <w:t>tracking_list</w:t>
+      </w:r>
+      <w:proofErr w:type="spellEnd"/>
+      <w:r>
+        <w:t>” is what will be downloaded for THAT run</w:t>
+      </w:r>
+    </w:p>
+    <w:p>
+      <w:pPr>
+        <w:pStyle w:val="ListParagraph"/>
+        <w:numPr>
+          <w:ilvl w:val="1"/>
+          <w:numId w:val="1"/>
+        </w:numPr>
+      </w:pPr>
+      <w:r>
+        <w:t xml:space="preserve">Edit tracking list to what you want </w:t>
+      </w:r>
+      <w:proofErr w:type="gramStart"/>
+      <w:r>
+        <w:t>for</w:t>
+      </w:r>
+      <w:proofErr w:type="gramEnd"/>
+      <w:r>
+        <w:t xml:space="preserve"> run and then save file. Change </w:t>
+      </w:r>
+      <w:proofErr w:type="spellStart"/>
+      <w:r>
+        <w:t>config_</w:t>
+      </w:r>
+      <w:proofErr w:type="gramStart"/>
+      <w:r>
+        <w:t>private.json</w:t>
+      </w:r>
+      <w:proofErr w:type="spellEnd"/>
+      <w:proofErr w:type="gramEnd"/>
+      <w:r>
+        <w:t xml:space="preserve"> “taxonomy / </w:t>
+      </w:r>
+      <w:proofErr w:type="spellStart"/>
+      <w:r>
+        <w:t>tracking_list</w:t>
+      </w:r>
+      <w:proofErr w:type="spellEnd"/>
+      <w:r>
+        <w:t>” file path to match. (Make sure to save file)</w:t>
       </w:r>
     </w:p>
     <w:p>
@@ -127,7 +213,23 @@
         </w:numPr>
       </w:pPr>
       <w:r>
-        <w:t>“taxon_name_map” is the list of taxon_ids WITHIN iNAT</w:t>
+        <w:t xml:space="preserve">If you want to not use </w:t>
+      </w:r>
+      <w:proofErr w:type="spellStart"/>
+      <w:r>
+        <w:t>date_checked</w:t>
+      </w:r>
+      <w:proofErr w:type="spellEnd"/>
+      <w:r>
+        <w:t xml:space="preserve"> (for plants) just delete </w:t>
+      </w:r>
+      <w:proofErr w:type="spellStart"/>
+      <w:r>
+        <w:t>filepath</w:t>
+      </w:r>
+      <w:proofErr w:type="spellEnd"/>
+      <w:r>
+        <w:t xml:space="preserve"> name (leave “”).</w:t>
       </w:r>
     </w:p>
     <w:p>
@@ -139,7 +241,61 @@
         </w:numPr>
       </w:pPr>
       <w:r>
-        <w:t>If you need to update taxon_name_map for iNat:</w:t>
+        <w:t>“</w:t>
+      </w:r>
+      <w:proofErr w:type="spellStart"/>
+      <w:proofErr w:type="gramStart"/>
+      <w:r>
+        <w:t>taxon</w:t>
+      </w:r>
+      <w:proofErr w:type="gramEnd"/>
+      <w:r>
+        <w:t>_name_map</w:t>
+      </w:r>
+      <w:proofErr w:type="spellEnd"/>
+      <w:r>
+        <w:t xml:space="preserve">” is the list of </w:t>
+      </w:r>
+      <w:proofErr w:type="spellStart"/>
+      <w:r>
+        <w:t>taxon_ids</w:t>
+      </w:r>
+      <w:proofErr w:type="spellEnd"/>
+      <w:r>
+        <w:t xml:space="preserve"> WITHIN </w:t>
+      </w:r>
+      <w:proofErr w:type="spellStart"/>
+      <w:r>
+        <w:t>iNAT</w:t>
+      </w:r>
+      <w:proofErr w:type="spellEnd"/>
+    </w:p>
+    <w:p>
+      <w:pPr>
+        <w:pStyle w:val="ListParagraph"/>
+        <w:numPr>
+          <w:ilvl w:val="0"/>
+          <w:numId w:val="1"/>
+        </w:numPr>
+      </w:pPr>
+      <w:r>
+        <w:t xml:space="preserve">If you need to update </w:t>
+      </w:r>
+      <w:proofErr w:type="spellStart"/>
+      <w:r>
+        <w:t>taxon_name_map</w:t>
+      </w:r>
+      <w:proofErr w:type="spellEnd"/>
+      <w:r>
+        <w:t xml:space="preserve"> for </w:t>
+      </w:r>
+      <w:proofErr w:type="spellStart"/>
+      <w:r>
+        <w:t>iNat</w:t>
+      </w:r>
+      <w:proofErr w:type="spellEnd"/>
+      <w:r>
+        <w:t>:</w:t>
       </w:r>
     </w:p>
     <w:p>
@@ -151,11 +307,24 @@
         </w:numPr>
       </w:pPr>
       <w:r>
-        <w:t>Record manual changes at iNat</w:t>
-      </w:r>
-      <w:r>
-        <w:t>_scraper\taxonomy\Manual_taxon_id_updates</w:t>
-      </w:r>
+        <w:t xml:space="preserve">Record manual changes at </w:t>
+      </w:r>
+      <w:proofErr w:type="spellStart"/>
+      <w:r>
+        <w:t>iNat</w:t>
+      </w:r>
+      <w:r>
+        <w:t>_scraper</w:t>
+      </w:r>
+      <w:proofErr w:type="spellEnd"/>
+      <w:r>
+        <w:t>\taxonomy\</w:t>
+      </w:r>
+      <w:proofErr w:type="spellStart"/>
+      <w:r>
+        <w:t>Manual_taxon_id_updates</w:t>
+      </w:r>
+      <w:proofErr w:type="spellEnd"/>
     </w:p>
     <w:p>
       <w:pPr>
@@ -166,8 +335,29 @@
         </w:numPr>
       </w:pPr>
       <w:r>
-        <w:t>Add iNat_name and taxon_id in taxon_name_map</w:t>
-      </w:r>
+        <w:t xml:space="preserve">Add </w:t>
+      </w:r>
+      <w:proofErr w:type="spellStart"/>
+      <w:r>
+        <w:t>iNat_name</w:t>
+      </w:r>
+      <w:proofErr w:type="spellEnd"/>
+      <w:r>
+        <w:t xml:space="preserve"> and </w:t>
+      </w:r>
+      <w:proofErr w:type="spellStart"/>
+      <w:r>
+        <w:t>taxon_id</w:t>
+      </w:r>
+      <w:proofErr w:type="spellEnd"/>
+      <w:r>
+        <w:t xml:space="preserve"> in </w:t>
+      </w:r>
+      <w:proofErr w:type="spellStart"/>
+      <w:r>
+        <w:t>taxon_name_map</w:t>
+      </w:r>
+      <w:proofErr w:type="spellEnd"/>
     </w:p>
     <w:p>
       <w:pPr>
@@ -233,7 +423,23 @@
     </w:p>
     <w:p>
       <w:r>
-        <w:t>Output will be saved to tracked_obs folder. Files have datestamp but will overwrite outputs from the same day! Move output files to another folder or rename if doing multiple runs in the same day.</w:t>
+        <w:t xml:space="preserve">Output will be saved to </w:t>
+      </w:r>
+      <w:proofErr w:type="spellStart"/>
+      <w:r>
+        <w:t>tracked_obs</w:t>
+      </w:r>
+      <w:proofErr w:type="spellEnd"/>
+      <w:r>
+        <w:t xml:space="preserve"> folder. Files have </w:t>
+      </w:r>
+      <w:proofErr w:type="spellStart"/>
+      <w:r>
+        <w:t>datestamp</w:t>
+      </w:r>
+      <w:proofErr w:type="spellEnd"/>
+      <w:r>
+        <w:t xml:space="preserve"> but will overwrite outputs from the same day! Move output files to another folder or rename if doing multiple runs in the same day.</w:t>
       </w:r>
     </w:p>
     <w:p>
@@ -981,7 +1187,6 @@
   <w:style w:type="character" w:default="1" w:styleId="DefaultParagraphFont">
     <w:name w:val="Default Paragraph Font"/>
     <w:uiPriority w:val="1"/>
-    <w:semiHidden/>
     <w:unhideWhenUsed/>
   </w:style>
   <w:style w:type="table" w:default="1" w:styleId="TableNormal">
@@ -1293,6 +1498,29 @@
       <w:smallCaps/>
       <w:color w:val="0F4761" w:themeColor="accent1" w:themeShade="BF"/>
       <w:spacing w:val="5"/>
+    </w:rPr>
+  </w:style>
+  <w:style w:type="character" w:styleId="Hyperlink">
+    <w:name w:val="Hyperlink"/>
+    <w:basedOn w:val="DefaultParagraphFont"/>
+    <w:uiPriority w:val="99"/>
+    <w:unhideWhenUsed/>
+    <w:rsid w:val="00F5069D"/>
+    <w:rPr>
+      <w:color w:val="467886" w:themeColor="hyperlink"/>
+      <w:u w:val="single"/>
+    </w:rPr>
+  </w:style>
+  <w:style w:type="character" w:styleId="UnresolvedMention">
+    <w:name w:val="Unresolved Mention"/>
+    <w:basedOn w:val="DefaultParagraphFont"/>
+    <w:uiPriority w:val="99"/>
+    <w:semiHidden/>
+    <w:unhideWhenUsed/>
+    <w:rsid w:val="00F5069D"/>
+    <w:rPr>
+      <w:color w:val="605E5C"/>
+      <w:shd w:val="clear" w:color="auto" w:fill="E1DFDD"/>
     </w:rPr>
   </w:style>
 </w:styles>

</xml_diff>

<commit_message>
Merging with offline version on hard drive
</commit_message>
<xml_diff>
--- a/iNat scraper run instructions.docx
+++ b/iNat scraper run instructions.docx
@@ -45,9 +45,26 @@
     </w:p>
     <w:p>
       <w:r>
-        <w:t>File -&gt; Open</w:t>
-      </w:r>
-      <w:r>
+        <w:t xml:space="preserve">Double check that folder is open. If not, </w:t>
+      </w:r>
+    </w:p>
+    <w:p>
+      <w:pPr>
+        <w:ind w:firstLine="720"/>
+      </w:pPr>
+      <w:r>
+        <w:t xml:space="preserve">File -&gt; </w:t>
+      </w:r>
+      <w:r>
+        <w:rPr>
+          <w:highlight w:val="yellow"/>
+        </w:rPr>
+        <w:t>Open</w:t>
+      </w:r>
+      <w:r>
+        <w:rPr>
+          <w:highlight w:val="yellow"/>
+        </w:rPr>
         <w:t xml:space="preserve"> folder</w:t>
       </w:r>
       <w:r>
@@ -58,6 +75,20 @@
       </w:r>
     </w:p>
     <w:p>
+      <w:pPr>
+        <w:ind w:firstLine="720"/>
+      </w:pPr>
+      <w:r>
+        <w:rPr>
+          <w:highlight w:val="yellow"/>
+        </w:rPr>
+        <w:t>Select folder</w:t>
+      </w:r>
+    </w:p>
+    <w:p>
+      <w:pPr>
+        <w:ind w:firstLine="720"/>
+      </w:pPr>
       <w:r>
         <w:t>Open File -&gt; CNHP_iNat_Scraper.py</w:t>
       </w:r>
@@ -299,28 +330,18 @@
       <w:pPr>
         <w:pStyle w:val="ListParagraph"/>
         <w:numPr>
-          <w:ilvl w:val="0"/>
+          <w:ilvl w:val="1"/>
           <w:numId w:val="1"/>
         </w:numPr>
-      </w:pPr>
-      <w:r>
-        <w:t xml:space="preserve">If you want to not use </w:t>
-      </w:r>
-      <w:proofErr w:type="spellStart"/>
-      <w:r>
-        <w:t>date_checked</w:t>
-      </w:r>
-      <w:proofErr w:type="spellEnd"/>
-      <w:r>
-        <w:t xml:space="preserve"> (for plants) just delete </w:t>
-      </w:r>
-      <w:proofErr w:type="spellStart"/>
-      <w:r>
-        <w:t>filepath</w:t>
-      </w:r>
-      <w:proofErr w:type="spellEnd"/>
-      <w:r>
-        <w:t xml:space="preserve"> name (leave “”).</w:t>
+        <w:rPr>
+          <w:highlight w:val="green"/>
+        </w:rPr>
+      </w:pPr>
+      <w:r>
+        <w:rPr>
+          <w:highlight w:val="green"/>
+        </w:rPr>
+        <w:t>Find table and “copy relative path” – paste in and change slash</w:t>
       </w:r>
     </w:p>
     <w:p>
@@ -332,34 +353,24 @@
         </w:numPr>
       </w:pPr>
       <w:r>
-        <w:t>“</w:t>
-      </w:r>
-      <w:proofErr w:type="spellStart"/>
-      <w:proofErr w:type="gramStart"/>
-      <w:r>
-        <w:t>taxon</w:t>
-      </w:r>
-      <w:proofErr w:type="gramEnd"/>
-      <w:r>
-        <w:t>_name_map</w:t>
-      </w:r>
-      <w:proofErr w:type="spellEnd"/>
-      <w:r>
-        <w:t xml:space="preserve">” is the list of </w:t>
-      </w:r>
-      <w:proofErr w:type="spellStart"/>
-      <w:r>
-        <w:t>taxon_ids</w:t>
-      </w:r>
-      <w:proofErr w:type="spellEnd"/>
-      <w:r>
-        <w:t xml:space="preserve"> WITHIN </w:t>
-      </w:r>
-      <w:proofErr w:type="spellStart"/>
-      <w:r>
-        <w:t>iNAT</w:t>
-      </w:r>
-      <w:proofErr w:type="spellEnd"/>
+        <w:t xml:space="preserve">If you want to not use </w:t>
+      </w:r>
+      <w:proofErr w:type="spellStart"/>
+      <w:r>
+        <w:t>date_checked</w:t>
+      </w:r>
+      <w:proofErr w:type="spellEnd"/>
+      <w:r>
+        <w:t xml:space="preserve"> (for plants) just delete </w:t>
+      </w:r>
+      <w:proofErr w:type="spellStart"/>
+      <w:r>
+        <w:t>filepath</w:t>
+      </w:r>
+      <w:proofErr w:type="spellEnd"/>
+      <w:r>
+        <w:t xml:space="preserve"> name (leave “”).</w:t>
+      </w:r>
     </w:p>
     <w:p>
       <w:pPr>
@@ -370,6 +381,44 @@
         </w:numPr>
       </w:pPr>
       <w:r>
+        <w:t>“</w:t>
+      </w:r>
+      <w:proofErr w:type="spellStart"/>
+      <w:proofErr w:type="gramStart"/>
+      <w:r>
+        <w:t>taxon</w:t>
+      </w:r>
+      <w:proofErr w:type="gramEnd"/>
+      <w:r>
+        <w:t>_name_map</w:t>
+      </w:r>
+      <w:proofErr w:type="spellEnd"/>
+      <w:r>
+        <w:t xml:space="preserve">” is the list of </w:t>
+      </w:r>
+      <w:proofErr w:type="spellStart"/>
+      <w:r>
+        <w:t>taxon_ids</w:t>
+      </w:r>
+      <w:proofErr w:type="spellEnd"/>
+      <w:r>
+        <w:t xml:space="preserve"> WITHIN </w:t>
+      </w:r>
+      <w:proofErr w:type="spellStart"/>
+      <w:r>
+        <w:t>iNAT</w:t>
+      </w:r>
+      <w:proofErr w:type="spellEnd"/>
+    </w:p>
+    <w:p>
+      <w:pPr>
+        <w:pStyle w:val="ListParagraph"/>
+        <w:numPr>
+          <w:ilvl w:val="0"/>
+          <w:numId w:val="1"/>
+        </w:numPr>
+      </w:pPr>
+      <w:r>
         <w:t xml:space="preserve">If you need to update </w:t>
       </w:r>
       <w:proofErr w:type="spellStart"/>
@@ -378,11 +427,39 @@
       </w:r>
       <w:proofErr w:type="spellEnd"/>
       <w:r>
+        <w:t xml:space="preserve"> (</w:t>
+      </w:r>
+      <w:r>
+        <w:t>"taxonomy/taxon_name_mappings_20260115.csv"</w:t>
+      </w:r>
+      <w:r>
+        <w:t>)</w:t>
+      </w:r>
+      <w:r>
         <w:t xml:space="preserve"> for </w:t>
       </w:r>
       <w:proofErr w:type="spellStart"/>
       <w:r>
         <w:t>iNat</w:t>
+      </w:r>
+      <w:proofErr w:type="spellEnd"/>
+      <w:r>
+        <w:t xml:space="preserve"> – </w:t>
+      </w:r>
+      <w:r>
+        <w:rPr>
+          <w:i/>
+          <w:iCs/>
+        </w:rPr>
+        <w:t xml:space="preserve">do not change filename of </w:t>
+      </w:r>
+      <w:proofErr w:type="spellStart"/>
+      <w:r>
+        <w:rPr>
+          <w:i/>
+          <w:iCs/>
+        </w:rPr>
+        <w:t>taxon_name_map</w:t>
       </w:r>
       <w:proofErr w:type="spellEnd"/>
       <w:r>
@@ -416,6 +493,15 @@
         <w:t>Manual_taxon_id_updates</w:t>
       </w:r>
       <w:proofErr w:type="spellEnd"/>
+      <w:r>
+        <w:t>\</w:t>
+      </w:r>
+      <w:r>
+        <w:t xml:space="preserve"> taxon_name_mappings_gad_current</w:t>
+      </w:r>
+      <w:r>
+        <w:t>.csv</w:t>
+      </w:r>
     </w:p>
     <w:p>
       <w:pPr>
@@ -490,6 +576,7 @@
         <w:rPr>
           <w:noProof/>
         </w:rPr>
+        <w:lastRenderedPageBreak/>
         <w:drawing>
           <wp:inline distT="0" distB="0" distL="0" distR="0" wp14:anchorId="6D677D24" wp14:editId="4677C5DC">
             <wp:extent cx="5943600" cy="1128395"/>

</xml_diff>